<commit_message>
Enrich Data Admin DI from UO reporting roadmap
Add 1C:MDM master/subscriber model, centralized reference books,
change-approval workflow, mapping, MDM box role, and UO data
cleansing/reconciliation duties from the management reporting roadmap.

Co-authored-by: anufrievpg <anufrievpg@users.noreply.github.com>
</commit_message>
<xml_diff>
--- a/enco-obiti/files/ДИ Администратор данных 2025.docx
+++ b/enco-obiti/files/ДИ Администратор данных 2025.docx
@@ -542,7 +542,7 @@
                 <w:sz w:val="24"/>
                 <w:szCs w:val="24"/>
               </w:rPr>
-              <w:t xml:space="preserve">Обеспечение точности, непротиворечивости и актуальности мастер-данных и справочников в учётных системах (ERP, CRM, 1С-контур, УСЦ и др.); операционное исполнение MDM в блоке инженерии ОБИТИ — ведение справочников, валидация, права доступа и поддержание «единой версии правды» в операционном режиме.</w:t>
+              <w:t xml:space="preserve">Обеспечение точности, непротиворечивости и актуальности мастер-данных и справочников в учётных системах (ERP, CRM, 1С-контур, УСЦ и др.) как фундамента единого контура управленческой отчётности; операционное исполнение MDM в блоке инженерии ОБИТИ на целевой платформе 1С:МДМ (мастер-система, системы-подписчики) — ведение централизованных справочников, валидация, права доступа, регламент согласования изменений и поддержание «единой версии правды» / «золотого источника» в операционном режиме.</w:t>
             </w:r>
           </w:p>
         </w:tc>
@@ -634,7 +634,7 @@
           <w:sz w:val="24"/>
           <w:szCs w:val="24"/>
         </w:rPr>
-        <w:t>3.2. Заполнение и загрузка данных в системы; ведение справочников НСИ / MDM;</w:t>
+        <w:t>3.2. Заполнение и загрузка данных; ведение централизованных справочников НСИ / MDM в 1С:МДМ;</w:t>
       </w:r>
     </w:p>
     <w:p>
@@ -670,7 +670,7 @@
           <w:sz w:val="24"/>
           <w:szCs w:val="24"/>
         </w:rPr>
-        <w:t>3.4. Администрирование учётных систем в части данных (валидация, права доступа);</w:t>
+        <w:t>3.4. Администрирование мастер-данных в 1С:МДМ и учётных системах-подписчиках (валидация, права, согласование изменений);</w:t>
       </w:r>
     </w:p>
     <w:p>
@@ -688,7 +688,7 @@
           <w:sz w:val="24"/>
           <w:szCs w:val="24"/>
         </w:rPr>
-        <w:t>3.5. Создание регламентов и документации по заполнению данных;</w:t>
+        <w:t>3.5. Регламенты ведения MDM, маппинг справочников и документация по заполнению данных;</w:t>
       </w:r>
     </w:p>
     <w:p>
@@ -706,7 +706,25 @@
           <w:sz w:val="24"/>
           <w:szCs w:val="24"/>
         </w:rPr>
-        <w:t xml:space="preserve">3.6. Мониторинг, профилактика качества данных и обучение пользователей.</w:t>
+        <w:t>3.6. Мониторинг качества данных, участие в вычистке / сверках контура УО и обучение пользователей.</w:t>
+      </w:r>
+    </w:p>
+    <w:p>
+      <w:pPr>
+        <w:contextualSpacing/>
+        <w:rPr>
+          <w:rFonts w:ascii="Arial" w:hAnsi="Arial" w:cs="Arial"/>
+          <w:sz w:val="24"/>
+          <w:szCs w:val="24"/>
+        </w:rPr>
+      </w:pPr>
+      <w:r>
+        <w:rPr>
+          <w:rFonts w:ascii="Arial" w:hAnsi="Arial" w:cs="Arial"/>
+          <w:sz w:val="24"/>
+          <w:szCs w:val="24"/>
+        </w:rPr>
+        <w:t xml:space="preserve">3.7. Участие в построении единого контура управленческой отчётности в части мастер-данных (MDM-коробка).</w:t>
       </w:r>
     </w:p>
     <w:p>
@@ -902,7 +920,7 @@
           <w:sz w:val="24"/>
           <w:szCs w:val="24"/>
         </w:rPr>
-        <w:t xml:space="preserve">4.2.2. Ведёт справочники НСИ / MDM в операционном режиме: создание, блокировка, изменение позиций.</w:t>
+        <w:t>4.2.2. Ведёт централизованные справочники НСИ / MDM в операционном режиме (создание, изменение, блокировка / архивация): проекты и объекты, контрагенты, статьи и аналитики, ЦФО, договоры, номенклатура (в т.ч. группы: жилая, коммерческая, кладовые, машиноместа).</w:t>
       </w:r>
     </w:p>
     <w:p>
@@ -921,7 +939,7 @@
           <w:sz w:val="24"/>
           <w:szCs w:val="24"/>
         </w:rPr>
-        <w:t xml:space="preserve">4.2.3. Поддерживает актуальность данных в системах и синхронизирует действия с регламентами методологии MDM (блок процессов) и архитектурой мастер-источников (главный инженер-архитектор).</w:t>
+        <w:t>4.2.3. Обеспечивает работу по схеме «1С:МДМ — мастер, остальные системы — подписчики»; поддерживает актуальность данных и согласовывает действия с методологией MDM (блок процессов) и архитектурой мастер-источников / ESB (главный инженер-архитектор).</w:t>
       </w:r>
     </w:p>
     <w:p>
@@ -940,6 +958,25 @@
           <w:sz w:val="24"/>
           <w:szCs w:val="24"/>
         </w:rPr>
+        <w:t xml:space="preserve">4.2.4. Обеспечивает сквозные идентификаторы и обязательные атрибуты записей справочников (в т.ч. иерархия проектов: ГК → проект → очередь → корпус → секция → помещение) в соответствии с утверждённой моделью MDM.</w:t>
+      </w:r>
+    </w:p>
+    <w:p>
+      <w:pPr>
+        <w:contextualSpacing/>
+        <w:jc w:val="both"/>
+        <w:rPr>
+          <w:rFonts w:ascii="Arial" w:hAnsi="Arial" w:cs="Arial"/>
+          <w:sz w:val="24"/>
+          <w:szCs w:val="24"/>
+        </w:rPr>
+      </w:pPr>
+      <w:r>
+        <w:rPr>
+          <w:rFonts w:ascii="Arial" w:hAnsi="Arial" w:cs="Arial"/>
+          <w:sz w:val="24"/>
+          <w:szCs w:val="24"/>
+        </w:rPr>
         <w:t>В части 3.3.</w:t>
       </w:r>
     </w:p>
@@ -1035,7 +1072,7 @@
           <w:sz w:val="24"/>
           <w:szCs w:val="24"/>
         </w:rPr>
-        <w:t xml:space="preserve">4.4.1. Администрирует учётные системы в части данных: управление справочниками и критичными полями.</w:t>
+        <w:t>4.4.1. Администрирует мастер-данные в 1С:МДМ Управление мастер-данными КОРП и связанные справочники в системах-подписчиках (1С:Бухгалтерия, 1С:БитФинанс, 1С:УСО/УСЦ, CRM и др.).</w:t>
       </w:r>
     </w:p>
     <w:p>
@@ -1054,7 +1091,7 @@
           <w:sz w:val="24"/>
           <w:szCs w:val="24"/>
         </w:rPr>
-        <w:t xml:space="preserve">4.4.2. Настраивает правила валидации при вводе данных, предотвращающие создание «мусорных» записей.</w:t>
+        <w:t>4.4.2. Настраивает правила валидации при вводе данных и правила создания / изменения / архивации записей, предотвращающие создание «мусорных» позиций.</w:t>
       </w:r>
     </w:p>
     <w:p>
@@ -1111,6 +1148,25 @@
           <w:sz w:val="24"/>
           <w:szCs w:val="24"/>
         </w:rPr>
+        <w:t xml:space="preserve">4.4.5. Контролирует соблюдение порядка согласования изменений мастер-данных с владельцами справочников; инициирует уведомление систем-подписчиков при изменениях (в т.ч. через регламент синхронизации ESB Datareon).</w:t>
+      </w:r>
+    </w:p>
+    <w:p>
+      <w:pPr>
+        <w:contextualSpacing/>
+        <w:jc w:val="both"/>
+        <w:rPr>
+          <w:rFonts w:ascii="Arial" w:hAnsi="Arial" w:cs="Arial"/>
+          <w:sz w:val="24"/>
+          <w:szCs w:val="24"/>
+        </w:rPr>
+      </w:pPr>
+      <w:r>
+        <w:rPr>
+          <w:rFonts w:ascii="Arial" w:hAnsi="Arial" w:cs="Arial"/>
+          <w:sz w:val="24"/>
+          <w:szCs w:val="24"/>
+        </w:rPr>
         <w:t>В части 3.5.</w:t>
       </w:r>
     </w:p>
@@ -1130,7 +1186,7 @@
           <w:sz w:val="24"/>
           <w:szCs w:val="24"/>
         </w:rPr>
-        <w:t xml:space="preserve">4.5.1. Разрабатывает и внедряет корпоративные стандарты заполнения данных (с примерами) на основе методологии MDM блока процессов.</w:t>
+        <w:t>4.5.1. Разрабатывает и внедряет корпоративные стандарты и регламент ведения MDM (с примерами) на основе методологии блока процессов: заявка → согласование владельца справочника → внесение → уведомление подписчиков.</w:t>
       </w:r>
     </w:p>
     <w:p>
@@ -1168,7 +1224,7 @@
           <w:sz w:val="24"/>
           <w:szCs w:val="24"/>
         </w:rPr>
-        <w:t xml:space="preserve">4.5.3. Ведёт карту источников данных и схемы их движения (data lineage на операционном уровне).</w:t>
+        <w:t>4.5.3. Ведёт карту источников данных и схемы их движения; поддерживает таблицы маппинга между учётными и операционными системами (в т.ч. РСБУ ↔ УО, статьи 1С ↔ статьи УО, статусы CRM при миграциях) на операционном уровне.</w:t>
       </w:r>
     </w:p>
     <w:p>
@@ -1187,6 +1243,25 @@
           <w:sz w:val="24"/>
           <w:szCs w:val="24"/>
         </w:rPr>
+        <w:t xml:space="preserve">4.5.4. Участвует в подготовке и актуализации модели MDM / MDM-коробки единого контура управленческой отчётности: роли (владельцы, операторы, контролёры), перечень централизуемых справочников, правила дедупликации.</w:t>
+      </w:r>
+    </w:p>
+    <w:p>
+      <w:pPr>
+        <w:contextualSpacing/>
+        <w:jc w:val="both"/>
+        <w:rPr>
+          <w:rFonts w:ascii="Arial" w:hAnsi="Arial" w:cs="Arial"/>
+          <w:sz w:val="24"/>
+          <w:szCs w:val="24"/>
+        </w:rPr>
+      </w:pPr>
+      <w:r>
+        <w:rPr>
+          <w:rFonts w:ascii="Arial" w:hAnsi="Arial" w:cs="Arial"/>
+          <w:sz w:val="24"/>
+          <w:szCs w:val="24"/>
+        </w:rPr>
         <w:t>В части 3.6.</w:t>
       </w:r>
     </w:p>
@@ -1206,7 +1281,7 @@
           <w:sz w:val="24"/>
           <w:szCs w:val="24"/>
         </w:rPr>
-        <w:t xml:space="preserve">4.6.1. Проводит регулярные проверки соответствия данных стандартам; инициирует исправление критичных отклонений.</w:t>
+        <w:t>4.6.1. Проводит регулярные проверки соответствия данных стандартам и «золотому источнику» по доменам; инициирует исправление критичных отклонений.</w:t>
       </w:r>
     </w:p>
     <w:p>
@@ -1263,7 +1338,102 @@
           <w:sz w:val="24"/>
           <w:szCs w:val="24"/>
         </w:rPr>
-        <w:t xml:space="preserve">4.6.4. Взаимодействует с Главным инженером-архитектором, методологом MDM (блок процессов), отделом данных и бизнес-владельцами НСИ по RACI MDM.</w:t>
+        <w:t>4.6.4. Взаимодействует с Главным инженером-архитектором, методологом MDM (блок процессов), отделом данных, бизнес-владельцами НСИ и рабочей группой контура УО по RACI MDM.</w:t>
+      </w:r>
+    </w:p>
+    <w:p>
+      <w:pPr>
+        <w:contextualSpacing/>
+        <w:jc w:val="both"/>
+        <w:rPr>
+          <w:rFonts w:ascii="Arial" w:hAnsi="Arial" w:cs="Arial"/>
+          <w:sz w:val="24"/>
+          <w:szCs w:val="24"/>
+        </w:rPr>
+      </w:pPr>
+      <w:r>
+        <w:rPr>
+          <w:rFonts w:ascii="Arial" w:hAnsi="Arial" w:cs="Arial"/>
+          <w:sz w:val="24"/>
+          <w:szCs w:val="24"/>
+        </w:rPr>
+        <w:t xml:space="preserve">В части 3.7.</w:t>
+      </w:r>
+    </w:p>
+    <w:p>
+      <w:pPr>
+        <w:contextualSpacing/>
+        <w:jc w:val="both"/>
+        <w:rPr>
+          <w:rFonts w:ascii="Arial" w:hAnsi="Arial" w:cs="Arial"/>
+          <w:sz w:val="24"/>
+          <w:szCs w:val="24"/>
+        </w:rPr>
+      </w:pPr>
+      <w:r>
+        <w:rPr>
+          <w:rFonts w:ascii="Arial" w:hAnsi="Arial" w:cs="Arial"/>
+          <w:sz w:val="24"/>
+          <w:szCs w:val="24"/>
+        </w:rPr>
+        <w:t xml:space="preserve">4.7.1. Участвует в проектах единого контура управленческой отчётности в роли оператора / контролёра мастер-данных MDM-коробки.</w:t>
+      </w:r>
+    </w:p>
+    <w:p>
+      <w:pPr>
+        <w:contextualSpacing/>
+        <w:jc w:val="both"/>
+        <w:rPr>
+          <w:rFonts w:ascii="Arial" w:hAnsi="Arial" w:cs="Arial"/>
+          <w:sz w:val="24"/>
+          <w:szCs w:val="24"/>
+        </w:rPr>
+      </w:pPr>
+      <w:r>
+        <w:rPr>
+          <w:rFonts w:ascii="Arial" w:hAnsi="Arial" w:cs="Arial"/>
+          <w:sz w:val="24"/>
+          <w:szCs w:val="24"/>
+        </w:rPr>
+        <w:t xml:space="preserve">4.7.2. Выполняет вычистку и стандартизацию данных, критичных для УО: приходная часть, допсоглашения и расторжения, сверка данных бухгалтерии и CRM, инвентаризация аналитик ЭСКРОУ (в части справочников и идентификаторов).</w:t>
+      </w:r>
+    </w:p>
+    <w:p>
+      <w:pPr>
+        <w:contextualSpacing/>
+        <w:jc w:val="both"/>
+        <w:rPr>
+          <w:rFonts w:ascii="Arial" w:hAnsi="Arial" w:cs="Arial"/>
+          <w:sz w:val="24"/>
+          <w:szCs w:val="24"/>
+        </w:rPr>
+      </w:pPr>
+      <w:r>
+        <w:rPr>
+          <w:rFonts w:ascii="Arial" w:hAnsi="Arial" w:cs="Arial"/>
+          <w:sz w:val="24"/>
+          <w:szCs w:val="24"/>
+        </w:rPr>
+        <w:t xml:space="preserve">4.7.3. Поддерживает качество мастер-данных для наполнения DWH / витрин УО: проекты, статьи, ЦФО, контрагенты, договоры, номенклатура — как измерения («золотой источник» 1С:МДМ).</w:t>
+      </w:r>
+    </w:p>
+    <w:p>
+      <w:pPr>
+        <w:contextualSpacing/>
+        <w:jc w:val="both"/>
+        <w:rPr>
+          <w:rFonts w:ascii="Arial" w:hAnsi="Arial" w:cs="Arial"/>
+          <w:sz w:val="24"/>
+          <w:szCs w:val="24"/>
+        </w:rPr>
+      </w:pPr>
+      <w:r>
+        <w:rPr>
+          <w:rFonts w:ascii="Arial" w:hAnsi="Arial" w:cs="Arial"/>
+          <w:sz w:val="24"/>
+          <w:szCs w:val="24"/>
+        </w:rPr>
+        <w:t xml:space="preserve">4.7.4. Участвует в сверках и устранении расхождений между мастер-данными и системами-подписчиками на этапах консолидации, миграции и интеграции контура УО.</w:t>
       </w:r>
     </w:p>
     <w:p>
@@ -1407,7 +1577,34 @@
         </w:rPr>
         <w:t>•</w:t>
         <w:tab/>
-        <w:t>Методологии и регламенты ОБИТИ (MDM / НСИ, стандарты заполнения справочников, карта источников данных);</w:t>
+        <w:t>Методологии и регламенты ОБИТИ и контура УО (MDM / НСИ, 1С:МДМ, стандарты заполнения справочников, карта источников данных, маппинг);</w:t>
+      </w:r>
+      <w:r>
+        <w:rPr>
+          <w:rFonts w:ascii="Arial" w:hAnsi="Arial" w:cs="Arial"/>
+          <w:sz w:val="24"/>
+          <w:szCs w:val="24"/>
+        </w:rPr>
+      </w:r>
+    </w:p>
+    <w:p>
+      <w:pPr>
+        <w:contextualSpacing/>
+        <w:rPr>
+          <w:rFonts w:ascii="Arial" w:hAnsi="Arial" w:cs="Arial"/>
+          <w:sz w:val="24"/>
+          <w:szCs w:val="24"/>
+        </w:rPr>
+      </w:pPr>
+      <w:r>
+        <w:rPr>
+          <w:rFonts w:ascii="Arial" w:hAnsi="Arial" w:cs="Arial"/>
+          <w:sz w:val="24"/>
+          <w:szCs w:val="24"/>
+        </w:rPr>
+        <w:t xml:space="preserve">•	Дорожная карта построения единого контура управленческой отчётности (в части MDM и качества мастер-данных);</w:t>
+        <w:tab/>
+        <w:t/>
       </w:r>
       <w:r>
         <w:rPr>
@@ -1940,7 +2137,7 @@
               <w:rPr>
                 <w:rFonts w:ascii="Arial" w:hAnsi="Arial" w:cs="Arial"/>
               </w:rPr>
-              <w:t xml:space="preserve">• Навык написания чётких регламентов и инструкций для нетехнических пользователей.</w:t>
+              <w:t xml:space="preserve">• Понимание модели мастер-данных: мастер-система / системы-подписчики, владельцы справочников, операторы, контролёры.</w:t>
             </w:r>
             <w:proofErr w:type="spellStart"/>
             <w:r>
@@ -2005,7 +2202,7 @@
               <w:rPr>
                 <w:rFonts w:ascii="Arial" w:hAnsi="Arial" w:cs="Arial"/>
               </w:rPr>
-              <w:t xml:space="preserve">• Педантичность, внимание к деталям, настойчивость в вопросах порядка данных.</w:t>
+              <w:t xml:space="preserve">• Навык написания чётких регламентов и инструкций для нетехнических пользователей.</w:t>
             </w:r>
             <w:proofErr w:type="spellStart"/>
             <w:r>
@@ -2070,7 +2267,7 @@
               <w:rPr>
                 <w:rFonts w:ascii="Arial" w:hAnsi="Arial" w:cs="Arial"/>
               </w:rPr>
-              <w:t xml:space="preserve">• Желательно: SQL (SELECT / UPDATE / DELETE / JOIN), ETL (Power BI Dataflow, SSIS, Pentaho и др.), fuzzy matching, настройка валидаций в 1С / CRM, опыт миграций данных, понимание ПДн.</w:t>
+              <w:t xml:space="preserve">• Педантичность, внимание к деталям, настойчивость в вопросах порядка данных.</w:t>
             </w:r>
             <w:proofErr w:type="spellStart"/>
             <w:r>
@@ -2135,7 +2332,72 @@
               <w:rPr>
                 <w:rFonts w:ascii="Arial" w:hAnsi="Arial" w:cs="Arial"/>
               </w:rPr>
-              <w:t xml:space="preserve">• Плюс: сложный SQL, MDM-платформы (в т.ч. 1С), Data Governance (RACI, Data Quality Metrics), документирование data lineage.</w:t>
+              <w:t xml:space="preserve">• Желательно: SQL (SELECT / UPDATE / DELETE / JOIN), ETL (Power BI Dataflow, SSIS, Pentaho и др.), fuzzy matching, настройка валидаций в 1С / CRM, опыт миграций и сверок данных, понимание ПДн.</w:t>
+            </w:r>
+            <w:proofErr w:type="spellStart"/>
+            <w:r>
+              <w:rPr>
+                <w:rFonts w:ascii="Arial" w:hAnsi="Arial" w:cs="Arial"/>
+              </w:rPr>
+            </w:r>
+            <w:proofErr w:type="spellEnd"/>
+            <w:r>
+              <w:rPr>
+                <w:rFonts w:ascii="Arial" w:hAnsi="Arial" w:cs="Arial"/>
+              </w:rPr>
+            </w:r>
+            <w:proofErr w:type="spellStart"/>
+            <w:r>
+              <w:rPr>
+                <w:rFonts w:ascii="Arial" w:hAnsi="Arial" w:cs="Arial"/>
+              </w:rPr>
+            </w:r>
+            <w:proofErr w:type="spellEnd"/>
+            <w:r>
+              <w:rPr>
+                <w:rFonts w:ascii="Arial" w:hAnsi="Arial" w:cs="Arial"/>
+              </w:rPr>
+            </w:r>
+            <w:proofErr w:type="spellStart"/>
+            <w:r>
+              <w:rPr>
+                <w:rFonts w:ascii="Arial" w:hAnsi="Arial" w:cs="Arial"/>
+              </w:rPr>
+            </w:r>
+            <w:proofErr w:type="spellEnd"/>
+            <w:r>
+              <w:rPr>
+                <w:rFonts w:ascii="Arial" w:hAnsi="Arial" w:cs="Arial"/>
+              </w:rPr>
+            </w:r>
+            <w:proofErr w:type="spellStart"/>
+            <w:r>
+              <w:rPr>
+                <w:rFonts w:ascii="Arial" w:hAnsi="Arial" w:cs="Arial"/>
+              </w:rPr>
+            </w:r>
+            <w:proofErr w:type="spellEnd"/>
+            <w:r>
+              <w:rPr>
+                <w:rFonts w:ascii="Arial" w:hAnsi="Arial" w:cs="Arial"/>
+              </w:rPr>
+            </w:r>
+          </w:p>
+          <w:p>
+            <w:pPr>
+              <w:pStyle w:val="ds-markdown-paragraph"/>
+              <w:shd w:val="clear" w:color="auto" w:fill="FFFFFF"/>
+              <w:spacing w:line="429" w:lineRule="atLeast"/>
+              <w:contextualSpacing/>
+              <w:rPr>
+                <w:rFonts w:ascii="Arial" w:hAnsi="Arial" w:cs="Arial"/>
+              </w:rPr>
+            </w:pPr>
+            <w:r>
+              <w:rPr>
+                <w:rFonts w:ascii="Arial" w:hAnsi="Arial" w:cs="Arial"/>
+              </w:rPr>
+              <w:t xml:space="preserve">• Плюс: 1С:МДМ, сложный SQL, Data Governance (RACI, Data Quality Metrics), документирование data lineage / маппинга.</w:t>
             </w:r>
             <w:proofErr w:type="spellStart"/>
             <w:r>
@@ -2234,7 +2496,7 @@
                 <w:sz w:val="24"/>
                 <w:szCs w:val="24"/>
               </w:rPr>
-              <w:t xml:space="preserve">Учётные системы и НСИ: 1С (Документооборот, Бухгалтерия, ЗУП, БИТ.Финанс / УСО·УСЦ и др.), CRM, справочники.</w:t>
+              <w:t xml:space="preserve">Целевая MDM: 1С:МДМ Управление мастер-данными КОРП.</w:t>
             </w:r>
             <w:proofErr w:type="spellStart"/>
             <w:r>
@@ -2317,7 +2579,7 @@
                 <w:sz w:val="24"/>
                 <w:szCs w:val="24"/>
               </w:rPr>
-              <w:t xml:space="preserve">Excel: Power Query, сводные, функции поиска и очистки.</w:t>
+              <w:t xml:space="preserve">Учётные системы и НСИ: 1С (Бухгалтерия, ЗУП, Документооборот, БитФинанс, УСО/УСЦ, CRM), MacroCRM / иные CRM, справочники.</w:t>
             </w:r>
             <w:proofErr w:type="spellStart"/>
             <w:r>
@@ -2400,7 +2662,90 @@
                 <w:sz w:val="24"/>
                 <w:szCs w:val="24"/>
               </w:rPr>
-              <w:t xml:space="preserve">Желательно: SQL; ETL / Dataflow; инструменты DQ / Observability.</w:t>
+              <w:t xml:space="preserve">Excel: Power Query, сводные, функции поиска и очистки.</w:t>
+            </w:r>
+            <w:proofErr w:type="spellStart"/>
+            <w:r>
+              <w:rPr>
+                <w:rFonts w:ascii="Arial" w:hAnsi="Arial" w:cs="Arial"/>
+                <w:sz w:val="24"/>
+                <w:szCs w:val="24"/>
+              </w:rPr>
+            </w:r>
+            <w:proofErr w:type="spellEnd"/>
+            <w:r>
+              <w:rPr>
+                <w:rFonts w:ascii="Arial" w:hAnsi="Arial" w:cs="Arial"/>
+                <w:sz w:val="24"/>
+                <w:szCs w:val="24"/>
+              </w:rPr>
+            </w:r>
+            <w:proofErr w:type="spellStart"/>
+            <w:r>
+              <w:rPr>
+                <w:rFonts w:ascii="Arial" w:hAnsi="Arial" w:cs="Arial"/>
+                <w:sz w:val="24"/>
+                <w:szCs w:val="24"/>
+              </w:rPr>
+            </w:r>
+            <w:proofErr w:type="spellEnd"/>
+            <w:r>
+              <w:rPr>
+                <w:rFonts w:ascii="Arial" w:hAnsi="Arial" w:cs="Arial"/>
+                <w:sz w:val="24"/>
+                <w:szCs w:val="24"/>
+              </w:rPr>
+            </w:r>
+            <w:proofErr w:type="spellStart"/>
+            <w:r>
+              <w:rPr>
+                <w:rFonts w:ascii="Arial" w:hAnsi="Arial" w:cs="Arial"/>
+                <w:sz w:val="24"/>
+                <w:szCs w:val="24"/>
+              </w:rPr>
+            </w:r>
+            <w:proofErr w:type="spellEnd"/>
+            <w:r>
+              <w:rPr>
+                <w:rFonts w:ascii="Arial" w:hAnsi="Arial" w:cs="Arial"/>
+                <w:sz w:val="24"/>
+                <w:szCs w:val="24"/>
+              </w:rPr>
+            </w:r>
+            <w:proofErr w:type="spellStart"/>
+            <w:r>
+              <w:rPr>
+                <w:rFonts w:ascii="Arial" w:hAnsi="Arial" w:cs="Arial"/>
+                <w:sz w:val="24"/>
+                <w:szCs w:val="24"/>
+              </w:rPr>
+            </w:r>
+            <w:proofErr w:type="spellEnd"/>
+            <w:r>
+              <w:rPr>
+                <w:rFonts w:ascii="Arial" w:hAnsi="Arial" w:cs="Arial"/>
+                <w:sz w:val="24"/>
+                <w:szCs w:val="24"/>
+              </w:rPr>
+            </w:r>
+          </w:p>
+          <w:p>
+            <w:pPr>
+              <w:contextualSpacing/>
+              <w:jc w:val="both"/>
+              <w:rPr>
+                <w:rFonts w:ascii="Arial" w:hAnsi="Arial" w:cs="Arial"/>
+                <w:sz w:val="24"/>
+                <w:szCs w:val="24"/>
+              </w:rPr>
+            </w:pPr>
+            <w:r>
+              <w:rPr>
+                <w:rFonts w:ascii="Arial" w:hAnsi="Arial" w:cs="Arial"/>
+                <w:sz w:val="24"/>
+                <w:szCs w:val="24"/>
+              </w:rPr>
+              <w:t xml:space="preserve">Желательно: SQL; ETL / Dataflow; ESB Datareon (на уровне понимания синхронизации подписчиков); инструменты DQ.</w:t>
             </w:r>
             <w:proofErr w:type="spellStart"/>
             <w:r>
@@ -2776,7 +3121,30 @@
                 <w:sz w:val="24"/>
                 <w:szCs w:val="24"/>
               </w:rPr>
-              <w:t xml:space="preserve">• Опыт взаимодействия с бизнес-подразделениями по изменению привычек ввода данных — преимущество.</w:t>
+              <w:t xml:space="preserve">• Опыт сверок, миграций или вычистки данных между учётными / CRM-системами — преимущество.</w:t>
+            </w:r>
+          </w:p>
+          <w:p>
+            <w:pPr>
+              <w:contextualSpacing/>
+              <w:jc w:val="both"/>
+              <w:rPr>
+                <w:rFonts w:ascii="Arial" w:hAnsi="Arial" w:cs="Arial"/>
+                <w:i/>
+                <w:iCs/>
+                <w:sz w:val="24"/>
+                <w:szCs w:val="24"/>
+              </w:rPr>
+            </w:pPr>
+            <w:r>
+              <w:rPr>
+                <w:rFonts w:ascii="Arial" w:hAnsi="Arial" w:cs="Arial"/>
+                <w:i/>
+                <w:iCs/>
+                <w:sz w:val="24"/>
+                <w:szCs w:val="24"/>
+              </w:rPr>
+              <w:t xml:space="preserve">• Опыт взаимодействия с бизнес-владельцами справочников по изменению привычек ввода — преимущество.</w:t>
             </w:r>
           </w:p>
         </w:tc>
@@ -3009,7 +3377,7 @@
                 <w:sz w:val="24"/>
                 <w:szCs w:val="24"/>
               </w:rPr>
-              <w:t xml:space="preserve">Доля критичных справочников с действующими правилами валидации и регламентом заполнения</w:t>
+              <w:t xml:space="preserve">Доля целевых централизованных справочников MDM (проекты, контрагенты, статьи, ЦФО, договоры, номенклатура) с регламентом и владельцем</w:t>
             </w:r>
           </w:p>
         </w:tc>
@@ -3039,7 +3407,7 @@
                 <w:sz w:val="24"/>
                 <w:szCs w:val="24"/>
               </w:rPr>
-              <w:t xml:space="preserve">100% целевых справочников по плану MDM</w:t>
+              <w:t xml:space="preserve">100% по утверждённому плану MDM</w:t>
             </w:r>
           </w:p>
         </w:tc>
@@ -3071,7 +3439,7 @@
                 <w:sz w:val="24"/>
                 <w:szCs w:val="24"/>
               </w:rPr>
-              <w:t xml:space="preserve">Своевременность обработки запросов на создание / изменение / блокировку позиций НСИ</w:t>
+              <w:t xml:space="preserve">Доля критичных справочников с действующими правилами валидации и порядком согласования изменений</w:t>
             </w:r>
           </w:p>
         </w:tc>
@@ -3101,7 +3469,7 @@
                 <w:sz w:val="24"/>
                 <w:szCs w:val="24"/>
               </w:rPr>
-              <w:t xml:space="preserve">Не менее 95% в срок SLA</w:t>
+              <w:t xml:space="preserve">100% целевых справочников по плану MDM</w:t>
             </w:r>
           </w:p>
         </w:tc>
@@ -3133,7 +3501,69 @@
                 <w:sz w:val="24"/>
                 <w:szCs w:val="24"/>
               </w:rPr>
-              <w:t xml:space="preserve">Доля инцидентов качества данных, закрытых с фиксацией причины и корректирующих действий</w:t>
+              <w:t xml:space="preserve">Своевременность обработки запросов на создание / изменение / блокировку позиций НСИ</w:t>
+            </w:r>
+          </w:p>
+        </w:tc>
+        <w:tc>
+          <w:tcPr>
+            <w:tcW w:w="0" w:type="auto"/>
+            <w:tcMar>
+              <w:top w:w="150" w:type="dxa"/>
+              <w:left w:w="240" w:type="dxa"/>
+              <w:bottom w:w="150" w:type="dxa"/>
+              <w:right w:w="240" w:type="dxa"/>
+            </w:tcMar>
+            <w:vAlign w:val="center"/>
+            <w:hideMark/>
+          </w:tcPr>
+          <w:p>
+            <w:pPr>
+              <w:rPr>
+                <w:rFonts w:ascii="Arial" w:hAnsi="Arial" w:cs="Arial"/>
+                <w:sz w:val="24"/>
+                <w:szCs w:val="24"/>
+              </w:rPr>
+            </w:pPr>
+            <w:r>
+              <w:rPr>
+                <w:rFonts w:ascii="Arial" w:hAnsi="Arial" w:cs="Arial"/>
+                <w:sz w:val="24"/>
+                <w:szCs w:val="24"/>
+              </w:rPr>
+              <w:t xml:space="preserve">Не менее 95% в срок SLA</w:t>
+            </w:r>
+          </w:p>
+        </w:tc>
+      </w:tr>
+      <w:tr>
+        <w:tc>
+          <w:tcPr>
+            <w:tcW w:w="0" w:type="auto"/>
+            <w:tcMar>
+              <w:top w:w="150" w:type="dxa"/>
+              <w:left w:w="0" w:type="dxa"/>
+              <w:bottom w:w="150" w:type="dxa"/>
+              <w:right w:w="240" w:type="dxa"/>
+            </w:tcMar>
+            <w:vAlign w:val="center"/>
+            <w:hideMark/>
+          </w:tcPr>
+          <w:p>
+            <w:pPr>
+              <w:rPr>
+                <w:rFonts w:ascii="Arial" w:hAnsi="Arial" w:cs="Arial"/>
+                <w:sz w:val="24"/>
+                <w:szCs w:val="24"/>
+              </w:rPr>
+            </w:pPr>
+            <w:r>
+              <w:rPr>
+                <w:rFonts w:ascii="Arial" w:hAnsi="Arial" w:cs="Arial"/>
+                <w:sz w:val="24"/>
+                <w:szCs w:val="24"/>
+              </w:rPr>
+              <w:t xml:space="preserve">Доля инцидентов качества мастер-данных / расхождений мастер↔подписчик, закрытых с фиксацией причины</w:t>
             </w:r>
           </w:p>
         </w:tc>

</xml_diff>